<commit_message>
[REQ-001344] - Compatibilidad BC v29
</commit_message>
<xml_diff>
--- a/Layouts/StandardSalesOrderConf.docx
+++ b/Layouts/StandardSalesOrderConf.docx
@@ -6707,8 +6707,6 @@
  
              < R e p o r t N a m e > R e p o r t   N a m e < / R e p o r t N a m e >   
-             < R e p o r t C a p t i o n > R e p o r t   C a p t i o n < / R e p o r t C a p t i o n > - 
              < A b o u t T h i s R e p o r t T i t l e > A b o u t   T h i s   R e p o r t   T i t l e < / A b o u t T h i s R e p o r t T i t l e >   
              < A b o u t T h i s R e p o r t T e x t > A b o u t   T h i s   R e p o r t   T e x t < / A b o u t T h i s R e p o r t T e x t > @@ -6754,84 +6752,6 @@
              < / D a t e T i m e V a l u e s >   
          < / R e p o r t R e q u e s t > - 
-         < C o m p a n y M e t a d a t a > - 
-             < C o m p a n y N a m e > C o m p a n y   N a m e < / C o m p a n y N a m e > - 
-             < C o m p a n y D i s p l a y N a m e > C o m p a n y   D i s p l a y   N a m e < / C o m p a n y D i s p l a y N a m e > - 
-             < C o m p a n y A d d r e s s L i n e s > - 
-                 < C o m p a n y A d d r e s s L i n e 1 > C o m p a n y   A d d r e s s   L i n e   1 < / C o m p a n y A d d r e s s L i n e 1 > - 
-                 < C o m p a n y A d d r e s s L i n e 2 > C o m p a n y   A d d r e s s   L i n e   2 < / C o m p a n y A d d r e s s L i n e 2 > - 
-                 < C o m p a n y A d d r e s s L i n e 3 > C o m p a n y   A d d r e s s   L i n e   3 < / C o m p a n y A d d r e s s L i n e 3 > - 
-                 < C o m p a n y A d d r e s s L i n e 4 > C o m p a n y   A d d r e s s   L i n e   4 < / C o m p a n y A d d r e s s L i n e 4 > - 
-                 < C o m p a n y A d d r e s s L i n e 5 > C o m p a n y   A d d r e s s   L i n e   5 < / C o m p a n y A d d r e s s L i n e 5 > - 
-                 < C o m p a n y A d d r e s s L i n e 6 > C o m p a n y   A d d r e s s   L i n e   6 < / C o m p a n y A d d r e s s L i n e 6 > - 
-                 < C o m p a n y A d d r e s s L i n e 7 > C o m p a n y   A d d r e s s   L i n e   7 < / C o m p a n y A d d r e s s L i n e 7 > - 
-                 < C o m p a n y A d d r e s s L i n e 8 > C o m p a n y   A d d r e s s   L i n e   8 < / C o m p a n y A d d r e s s L i n e 8 > - 
-             < / C o m p a n y A d d r e s s L i n e s > - 
-             < C o m p a n y P h o n e > C o m p a n y   P h o n e < / C o m p a n y P h o n e > - 
-             < C o m p a n y P h o n e C a p t i o n > C o m p a n y   P h o n e   C a p t i o n < / C o m p a n y P h o n e C a p t i o n > - 
-             < C o m p a n y F a x N o > C o m p a n y   F a x   N o . < / C o m p a n y F a x N o > - 
-             < C o m p a n y F a x N o C a p t i o n > C o m p a n y   F a x   N o .   C a p t i o n < / C o m p a n y F a x N o C a p t i o n > - 
-             < C o m p a n y E m a i l > C o m p a n y   E m a i l < / C o m p a n y E m a i l > - 
-             < C o m p a n y E m a i l C a p t i o n > C o m p a n y   E m a i l   C a p t i o n < / C o m p a n y E m a i l C a p t i o n > - 
-             < C o m p a n y H o m e P a g e > C o m p a n y   H o m e   P a g e < / C o m p a n y H o m e P a g e > - 
-             < C o m p a n y H o m e P a g e C a p t i o n > C o m p a n y   H o m e   P a g e   C a p t i o n < / C o m p a n y H o m e P a g e C a p t i o n > - 
-             < C o m p a n y L o g o > C o m p a n y   L o g o < / C o m p a n y L o g o > - 
-             < C o m p a n y V A T R e g i s t r a t i o n N o > C o m p a n y   V A T   R e g i s t r a t i o n   N o . < / C o m p a n y V A T R e g i s t r a t i o n N o > - 
-             < C o m p a n y V A T R e g i s t r a t i o n N o C a p t i o n > C o m p a n y   V A T   R e g i s t r a t i o n   N o .   C a p t i o n < / C o m p a n y V A T R e g i s t r a t i o n N o C a p t i o n > - 
-             < C o m p a n y R e g i s t r a t i o n N o > C o m p a n y   R e g i s t r a t i o n   N o . < / C o m p a n y R e g i s t r a t i o n N o > - 
-             < C o m p a n y R e g i s t r a t i o n N o C a p t i o n > C o m p a n y   R e g i s t r a t i o n   N o .   C a p t i o n < / C o m p a n y R e g i s t r a t i o n N o C a p t i o n > - 
-             < C o m p a n y B a n k N a m e > C o m p a n y   B a n k   N a m e < / C o m p a n y B a n k N a m e > - 
-             < C o m p a n y B a n k N a m e C a p t i o n > C o m p a n y   B a n k   N a m e   C a p t i o n < / C o m p a n y B a n k N a m e C a p t i o n > - 
-             < C o m p a n y B a n k A c c o u n t N o > C o m p a n y   B a n k   A c c o u n t   N o . < / C o m p a n y B a n k A c c o u n t N o > - 
-             < C o m p a n y B a n k A c c o u n t N o C a p t i o n > C o m p a n y   B a n k   A c c o u n t   N o .   C a p t i o n < / C o m p a n y B a n k A c c o u n t N o C a p t i o n > - 
-             < C o m p a n y B a n k B r a n c h N o > C o m p a n y   B a n k   B r a n c h   N o . < / C o m p a n y B a n k B r a n c h N o > - 
-             < C o m p a n y B a n k B r a n c h N o C a p t i o n > C o m p a n y   B a n k   B r a n c h   N o .   C a p t i o n < / C o m p a n y B a n k B r a n c h N o C a p t i o n > - 
-             < C o m p a n y I B A N > C o m p a n y   I B A N < / C o m p a n y I B A N > - 
-             < C o m p a n y I B A N C a p t i o n > C o m p a n y   I B A N   C a p t i o n < / C o m p a n y I B A N C a p t i o n > - 
-             < C o m p a n y B a n k S W I F T > C o m p a n y   B a n k   S W I F T < / C o m p a n y B a n k S W I F T > - 
-             < C o m p a n y B a n k S W I F T C a p t i o n > C o m p a n y   B a n k   S W I F T   C a p t i o n < / C o m p a n y B a n k S W I F T C a p t i o n > - 
-             < C o m p a n y G i r o N o > C o m p a n y   G i r o   N o . < / C o m p a n y G i r o N o > - 
-             < C o m p a n y G i r o N o C a p t i o n > C o m p a n y   G i r o   N o .   C a p t i o n < / C o m p a n y G i r o N o C a p t i o n > - 
-         < / C o m p a n y M e t a d a t a >   
      < / B C R e p o r t I n f o r m a t i o n >   
@@ -7348,8 +7268,6 @@
  
              < R e p o r t N a m e > R e p o r t   N a m e < / R e p o r t N a m e >   
-             < R e p o r t C a p t i o n > R e p o r t   C a p t i o n < / R e p o r t C a p t i o n > - 
              < A b o u t T h i s R e p o r t T i t l e > A b o u t   T h i s   R e p o r t   T i t l e < / A b o u t T h i s R e p o r t T i t l e >   
              < A b o u t T h i s R e p o r t T e x t > A b o u t   T h i s   R e p o r t   T e x t < / A b o u t T h i s R e p o r t T e x t > @@ -7395,84 +7313,6 @@
              < / D a t e T i m e V a l u e s >   
          < / R e p o r t R e q u e s t > - 
-         < C o m p a n y M e t a d a t a > - 
-             < C o m p a n y N a m e > C o m p a n y   N a m e < / C o m p a n y N a m e > - 
-             < C o m p a n y D i s p l a y N a m e > C o m p a n y   D i s p l a y   N a m e < / C o m p a n y D i s p l a y N a m e > - 
-             < C o m p a n y A d d r e s s L i n e s > - 
-                 < C o m p a n y A d d r e s s L i n e 1 > C o m p a n y   A d d r e s s   L i n e   1 < / C o m p a n y A d d r e s s L i n e 1 > - 
-                 < C o m p a n y A d d r e s s L i n e 2 > C o m p a n y   A d d r e s s   L i n e   2 < / C o m p a n y A d d r e s s L i n e 2 > - 
-                 < C o m p a n y A d d r e s s L i n e 3 > C o m p a n y   A d d r e s s   L i n e   3 < / C o m p a n y A d d r e s s L i n e 3 > - 
-                 < C o m p a n y A d d r e s s L i n e 4 > C o m p a n y   A d d r e s s   L i n e   4 < / C o m p a n y A d d r e s s L i n e 4 > - 
-                 < C o m p a n y A d d r e s s L i n e 5 > C o m p a n y   A d d r e s s   L i n e   5 < / C o m p a n y A d d r e s s L i n e 5 > - 
-                 < C o m p a n y A d d r e s s L i n e 6 > C o m p a n y   A d d r e s s   L i n e   6 < / C o m p a n y A d d r e s s L i n e 6 > - 
-                 < C o m p a n y A d d r e s s L i n e 7 > C o m p a n y   A d d r e s s   L i n e   7 < / C o m p a n y A d d r e s s L i n e 7 > - 
-                 < C o m p a n y A d d r e s s L i n e 8 > C o m p a n y   A d d r e s s   L i n e   8 < / C o m p a n y A d d r e s s L i n e 8 > - 
-             < / C o m p a n y A d d r e s s L i n e s > - 
-             < C o m p a n y P h o n e > C o m p a n y   P h o n e < / C o m p a n y P h o n e > - 
-             < C o m p a n y P h o n e C a p t i o n > C o m p a n y   P h o n e   C a p t i o n < / C o m p a n y P h o n e C a p t i o n > - 
-             < C o m p a n y F a x N o > C o m p a n y   F a x   N o . < / C o m p a n y F a x N o > - 
-             < C o m p a n y F a x N o C a p t i o n > C o m p a n y   F a x   N o .   C a p t i o n < / C o m p a n y F a x N o C a p t i o n > - 
-             < C o m p a n y E m a i l > C o m p a n y   E m a i l < / C o m p a n y E m a i l > - 
-             < C o m p a n y E m a i l C a p t i o n > C o m p a n y   E m a i l   C a p t i o n < / C o m p a n y E m a i l C a p t i o n > - 
-             < C o m p a n y H o m e P a g e > C o m p a n y   H o m e   P a g e < / C o m p a n y H o m e P a g e > - 
-             < C o m p a n y H o m e P a g e C a p t i o n > C o m p a n y   H o m e   P a g e   C a p t i o n < / C o m p a n y H o m e P a g e C a p t i o n > - 
-             < C o m p a n y L o g o > C o m p a n y   L o g o < / C o m p a n y L o g o > - 
-             < C o m p a n y V A T R e g i s t r a t i o n N o > C o m p a n y   V A T   R e g i s t r a t i o n   N o . < / C o m p a n y V A T R e g i s t r a t i o n N o > - 
-             < C o m p a n y V A T R e g i s t r a t i o n N o C a p t i o n > C o m p a n y   V A T   R e g i s t r a t i o n   N o .   C a p t i o n < / C o m p a n y V A T R e g i s t r a t i o n N o C a p t i o n > - 
-             < C o m p a n y R e g i s t r a t i o n N o > C o m p a n y   R e g i s t r a t i o n   N o . < / C o m p a n y R e g i s t r a t i o n N o > - 
-             < C o m p a n y R e g i s t r a t i o n N o C a p t i o n > C o m p a n y   R e g i s t r a t i o n   N o .   C a p t i o n < / C o m p a n y R e g i s t r a t i o n N o C a p t i o n > - 
-             < C o m p a n y B a n k N a m e > C o m p a n y   B a n k   N a m e < / C o m p a n y B a n k N a m e > - 
-             < C o m p a n y B a n k N a m e C a p t i o n > C o m p a n y   B a n k   N a m e   C a p t i o n < / C o m p a n y B a n k N a m e C a p t i o n > - 
-             < C o m p a n y B a n k A c c o u n t N o > C o m p a n y   B a n k   A c c o u n t   N o . < / C o m p a n y B a n k A c c o u n t N o > - 
-             < C o m p a n y B a n k A c c o u n t N o C a p t i o n > C o m p a n y   B a n k   A c c o u n t   N o .   C a p t i o n < / C o m p a n y B a n k A c c o u n t N o C a p t i o n > - 
-             < C o m p a n y B a n k B r a n c h N o > C o m p a n y   B a n k   B r a n c h   N o . < / C o m p a n y B a n k B r a n c h N o > - 
-             < C o m p a n y B a n k B r a n c h N o C a p t i o n > C o m p a n y   B a n k   B r a n c h   N o .   C a p t i o n < / C o m p a n y B a n k B r a n c h N o C a p t i o n > - 
-             < C o m p a n y I B A N > C o m p a n y   I B A N < / C o m p a n y I B A N > - 
-             < C o m p a n y I B A N C a p t i o n > C o m p a n y   I B A N   C a p t i o n < / C o m p a n y I B A N C a p t i o n > - 
-             < C o m p a n y B a n k S W I F T > C o m p a n y   B a n k   S W I F T < / C o m p a n y B a n k S W I F T > - 
-             < C o m p a n y B a n k S W I F T C a p t i o n > C o m p a n y   B a n k   S W I F T   C a p t i o n < / C o m p a n y B a n k S W I F T C a p t i o n > - 
-             < C o m p a n y G i r o N o > C o m p a n y   G i r o   N o . < / C o m p a n y G i r o N o > - 
-             < C o m p a n y G i r o N o C a p t i o n > C o m p a n y   G i r o   N o .   C a p t i o n < / C o m p a n y G i r o N o C a p t i o n > - 
-         < / C o m p a n y M e t a d a t a >   
      < / B C R e p o r t I n f o r m a t i o n >   

</xml_diff>